<commit_message>
MVP-1 step 3c: lobby screens, and staff accounts can't use lobbies
Browse with filters, 3-step create, edit, lobby page with join, host tools
and chat, and My lobbies on Home. Scheduling is limited to 24 hours.
Moderators and admins are refused lobby features, and being given either
role takes the person out of active lobbies. Spec v0.8.

Co-Authored-By: Claude Opus 5.5 <noreply@anthropic.com>
</commit_message>
<xml_diff>
--- a/Chill Hub - Requirements Specification.docx
+++ b/Chill Hub - Requirements Specification.docx
@@ -212,7 +212,7 @@
                 <w:sz w:val="20"/>
                 <w:szCs w:val="20"/>
               </w:rPr>
-              <w:t xml:space="preserve">0.6 (draft): hosting changed to a low-cost VPS, with two database options (on the VPS or on Neon Free)</w:t>
+              <w:t xml:space="preserve">0.8 (draft): Moderators and Admins can't use lobbies; lobbies can be scheduled up to 24 hours ahead</w:t>
             </w:r>
           </w:p>
         </w:tc>
@@ -1462,7 +1462,7 @@
                 <w:sz w:val="20"/>
                 <w:szCs w:val="20"/>
               </w:rPr>
-              <w:t xml:space="preserve">Everything a Player can do, plus: review reports, hide/remove content, warn/suspend users</w:t>
+              <w:t xml:space="preserve">Everything a Player can do except lobbies, plus: review reports, hide/remove content, warn/suspend users</w:t>
             </w:r>
           </w:p>
         </w:tc>
@@ -1644,7 +1644,7 @@
                 <w:sz w:val="20"/>
                 <w:szCs w:val="20"/>
               </w:rPr>
-              <w:t xml:space="preserve">Everything above, plus: approve/reject accounts, assign roles, manage the games list, post news, change system settings, ban users</w:t>
+              <w:t xml:space="preserve">Everything above except lobbies, plus: approve/reject accounts, assign roles, manage the games list, post news, change system settings, ban users</w:t>
             </w:r>
           </w:p>
         </w:tc>
@@ -1661,6 +1661,14 @@
       </w:pPr>
       <w:r>
         <w:t xml:space="preserve">A user can hold more than one role (e.g. Moderator + Tournament Organizer).</w:t>
+      </w:r>
+    </w:p>
+    <w:p>
+      <w:pPr>
+        <w:spacing w:after="120"/>
+      </w:pPr>
+      <w:r>
+        <w:t xml:space="preserve">Moderators and Admins can't find, create, join or chat in lobbies, even if they also hold the Player role, and they never see lobby codes. Being given either role takes the person out of their active lobbies and closes any they host. Admins can still delete a lobby for moderation.</w:t>
       </w:r>
     </w:p>
     <w:p>
@@ -4120,7 +4128,7 @@
                 <w:sz w:val="20"/>
                 <w:szCs w:val="20"/>
               </w:rPr>
-              <w:t xml:space="preserve">, number of open slots, rank range, needed roles, voice chat yes/no, start time ("now" or a scheduled time), and an optional note.</w:t>
+              <w:t xml:space="preserve">, number of open slots, rank range, needed roles, voice chat yes/no, start time ("now" or a scheduled time up to 24 hours ahead), and an optional note.</w:t>
             </w:r>
           </w:p>
         </w:tc>

</xml_diff>